<commit_message>
docs(report): align report with current architecture
</commit_message>
<xml_diff>
--- a/BaoCaoMoi (1).docx
+++ b/BaoCaoMoi (1).docx
@@ -26572,25 +26572,8 @@
             <w:hideMark/>
           </w:tcPr>
           <w:p>
-            <w:pPr>
-              <w:spacing w:after="160" w:line="278" w:lineRule="auto"/>
-              <w:rPr>
-                <w:rFonts w:ascii="Times New Roman" w:hAnsi="Times New Roman" w:cs="Times New Roman"/>
-                <w:b/>
-                <w:bCs/>
-                <w:sz w:val="20"/>
-                <w:szCs w:val="20"/>
-              </w:rPr>
-            </w:pPr>
-            <w:r>
-              <w:rPr>
-                <w:rFonts w:ascii="Times New Roman" w:hAnsi="Times New Roman" w:cs="Times New Roman"/>
-                <w:b/>
-                <w:bCs/>
-                <w:sz w:val="20"/>
-                <w:szCs w:val="20"/>
-              </w:rPr>
-              <w:t>role</w:t>
+            <w:r>
+              <w:t>role_id</w:t>
             </w:r>
           </w:p>
         </w:tc>
@@ -38775,15 +38758,9 @@
         </w:rPr>
       </w:pPr>
       <w:r>
-        <w:rPr>
-          <w:rFonts w:ascii="Times New Roman" w:hAnsi="Times New Roman" w:cs="Times New Roman"/>
-          <w:b/>
-          <w:bCs/>
-          <w:sz w:val="28"/>
-          <w:szCs w:val="28"/>
-        </w:rPr>
-        <w:lastRenderedPageBreak/>
-        <w:t>Bảng 9: INVOICE_DETAILS (Chi tiết các dòng thu trên hóa đơn)</w:t>
+        <w:t>Bảng 9: PAYMENTS (Giao dịch thanh toán)</w:t>
+        <w:br/>
+        <w:t>Trong kiến trúc triển khai hiện tại, thông tin chi tiết dịch vụ phục vụ lập hóa đơn được lưu trữ thông qua bảng appointment_services, trong đó lưu dịch vụ được chọn và price_at_booking. Vì vậy hệ thống không triển khai bảng vật lý riêng INVOICE_DETAILS.</w:t>
       </w:r>
     </w:p>
     <w:tbl>
@@ -38977,44 +38954,18 @@
             <w:hideMark/>
           </w:tcPr>
           <w:p>
-            <w:pPr>
-              <w:spacing w:after="160" w:line="278" w:lineRule="auto"/>
-              <w:rPr>
-                <w:rFonts w:ascii="Times New Roman" w:hAnsi="Times New Roman" w:cs="Times New Roman"/>
-                <w:sz w:val="20"/>
-                <w:szCs w:val="20"/>
-              </w:rPr>
-            </w:pPr>
-            <w:r>
-              <w:rPr>
-                <w:rFonts w:ascii="Times New Roman" w:hAnsi="Times New Roman" w:cs="Times New Roman"/>
-                <w:sz w:val="20"/>
-                <w:szCs w:val="20"/>
-              </w:rPr>
-              <w:t>item_id</w:t>
-            </w:r>
-          </w:p>
-        </w:tc>
-        <w:tc>
-          <w:tcPr>
-            <w:tcW w:w="0" w:type="auto"/>
-            <w:hideMark/>
-          </w:tcPr>
-          <w:p>
-            <w:pPr>
-              <w:spacing w:after="160" w:line="278" w:lineRule="auto"/>
-              <w:rPr>
-                <w:rFonts w:ascii="Times New Roman" w:hAnsi="Times New Roman" w:cs="Times New Roman"/>
-                <w:sz w:val="20"/>
-                <w:szCs w:val="20"/>
-              </w:rPr>
-            </w:pPr>
-            <w:r>
-              <w:rPr>
-                <w:rFonts w:ascii="Times New Roman" w:hAnsi="Times New Roman" w:cs="Times New Roman"/>
-                <w:sz w:val="20"/>
-                <w:szCs w:val="20"/>
-              </w:rPr>
+            <w:r>
+              <w:t>id</w:t>
+            </w:r>
+          </w:p>
+        </w:tc>
+        <w:tc>
+          <w:tcPr>
+            <w:tcW w:w="0" w:type="auto"/>
+            <w:hideMark/>
+          </w:tcPr>
+          <w:p>
+            <w:r>
               <w:t>INT</w:t>
             </w:r>
           </w:p>
@@ -39025,20 +38976,7 @@
             <w:hideMark/>
           </w:tcPr>
           <w:p>
-            <w:pPr>
-              <w:spacing w:after="160" w:line="278" w:lineRule="auto"/>
-              <w:rPr>
-                <w:rFonts w:ascii="Times New Roman" w:hAnsi="Times New Roman" w:cs="Times New Roman"/>
-                <w:sz w:val="20"/>
-                <w:szCs w:val="20"/>
-              </w:rPr>
-            </w:pPr>
-            <w:r>
-              <w:rPr>
-                <w:rFonts w:ascii="Times New Roman" w:hAnsi="Times New Roman" w:cs="Times New Roman"/>
-                <w:sz w:val="20"/>
-                <w:szCs w:val="20"/>
-              </w:rPr>
+            <w:r>
               <w:t>–</w:t>
             </w:r>
           </w:p>
@@ -39049,22 +38987,7 @@
             <w:hideMark/>
           </w:tcPr>
           <w:p>
-            <w:pPr>
-              <w:spacing w:after="160" w:line="278" w:lineRule="auto"/>
-              <w:rPr>
-                <w:rFonts w:ascii="Times New Roman" w:hAnsi="Times New Roman" w:cs="Times New Roman"/>
-                <w:sz w:val="20"/>
-                <w:szCs w:val="20"/>
-              </w:rPr>
-            </w:pPr>
-            <w:r>
-              <w:rPr>
-                <w:rFonts w:ascii="Times New Roman" w:hAnsi="Times New Roman" w:cs="Times New Roman"/>
-                <w:b/>
-                <w:bCs/>
-                <w:sz w:val="20"/>
-                <w:szCs w:val="20"/>
-              </w:rPr>
+            <w:r>
               <w:t>PK</w:t>
             </w:r>
           </w:p>
@@ -39075,20 +38998,7 @@
             <w:hideMark/>
           </w:tcPr>
           <w:p>
-            <w:pPr>
-              <w:spacing w:after="160" w:line="278" w:lineRule="auto"/>
-              <w:rPr>
-                <w:rFonts w:ascii="Times New Roman" w:hAnsi="Times New Roman" w:cs="Times New Roman"/>
-                <w:sz w:val="20"/>
-                <w:szCs w:val="20"/>
-              </w:rPr>
-            </w:pPr>
-            <w:r>
-              <w:rPr>
-                <w:rFonts w:ascii="Times New Roman" w:hAnsi="Times New Roman" w:cs="Times New Roman"/>
-                <w:sz w:val="20"/>
-                <w:szCs w:val="20"/>
-              </w:rPr>
+            <w:r>
               <w:t>NOT NULL</w:t>
             </w:r>
           </w:p>
@@ -39099,21 +39009,8 @@
             <w:hideMark/>
           </w:tcPr>
           <w:p>
-            <w:pPr>
-              <w:spacing w:after="160" w:line="278" w:lineRule="auto"/>
-              <w:rPr>
-                <w:rFonts w:ascii="Times New Roman" w:hAnsi="Times New Roman" w:cs="Times New Roman"/>
-                <w:sz w:val="20"/>
-                <w:szCs w:val="20"/>
-              </w:rPr>
-            </w:pPr>
-            <w:r>
-              <w:rPr>
-                <w:rFonts w:ascii="Times New Roman" w:hAnsi="Times New Roman" w:cs="Times New Roman"/>
-                <w:sz w:val="20"/>
-                <w:szCs w:val="20"/>
-              </w:rPr>
-              <w:t>Khóa chính của dòng chi tiết hóa đơn</w:t>
+            <w:r>
+              <w:t>Khóa chính giao dịch</w:t>
             </w:r>
           </w:p>
         </w:tc>
@@ -39125,20 +39022,7 @@
             <w:hideMark/>
           </w:tcPr>
           <w:p>
-            <w:pPr>
-              <w:spacing w:after="160" w:line="278" w:lineRule="auto"/>
-              <w:rPr>
-                <w:rFonts w:ascii="Times New Roman" w:hAnsi="Times New Roman" w:cs="Times New Roman"/>
-                <w:sz w:val="20"/>
-                <w:szCs w:val="20"/>
-              </w:rPr>
-            </w:pPr>
-            <w:r>
-              <w:rPr>
-                <w:rFonts w:ascii="Times New Roman" w:hAnsi="Times New Roman" w:cs="Times New Roman"/>
-                <w:sz w:val="20"/>
-                <w:szCs w:val="20"/>
-              </w:rPr>
+            <w:r>
               <w:t>invoice_id</w:t>
             </w:r>
           </w:p>
@@ -39149,20 +39033,7 @@
             <w:hideMark/>
           </w:tcPr>
           <w:p>
-            <w:pPr>
-              <w:spacing w:after="160" w:line="278" w:lineRule="auto"/>
-              <w:rPr>
-                <w:rFonts w:ascii="Times New Roman" w:hAnsi="Times New Roman" w:cs="Times New Roman"/>
-                <w:sz w:val="20"/>
-                <w:szCs w:val="20"/>
-              </w:rPr>
-            </w:pPr>
-            <w:r>
-              <w:rPr>
-                <w:rFonts w:ascii="Times New Roman" w:hAnsi="Times New Roman" w:cs="Times New Roman"/>
-                <w:sz w:val="20"/>
-                <w:szCs w:val="20"/>
-              </w:rPr>
+            <w:r>
               <w:t>INT</w:t>
             </w:r>
           </w:p>
@@ -39173,20 +39044,7 @@
             <w:hideMark/>
           </w:tcPr>
           <w:p>
-            <w:pPr>
-              <w:spacing w:after="160" w:line="278" w:lineRule="auto"/>
-              <w:rPr>
-                <w:rFonts w:ascii="Times New Roman" w:hAnsi="Times New Roman" w:cs="Times New Roman"/>
-                <w:sz w:val="20"/>
-                <w:szCs w:val="20"/>
-              </w:rPr>
-            </w:pPr>
-            <w:r>
-              <w:rPr>
-                <w:rFonts w:ascii="Times New Roman" w:hAnsi="Times New Roman" w:cs="Times New Roman"/>
-                <w:sz w:val="20"/>
-                <w:szCs w:val="20"/>
-              </w:rPr>
+            <w:r>
               <w:t>–</w:t>
             </w:r>
           </w:p>
@@ -39197,22 +39055,7 @@
             <w:hideMark/>
           </w:tcPr>
           <w:p>
-            <w:pPr>
-              <w:spacing w:after="160" w:line="278" w:lineRule="auto"/>
-              <w:rPr>
-                <w:rFonts w:ascii="Times New Roman" w:hAnsi="Times New Roman" w:cs="Times New Roman"/>
-                <w:sz w:val="20"/>
-                <w:szCs w:val="20"/>
-              </w:rPr>
-            </w:pPr>
-            <w:r>
-              <w:rPr>
-                <w:rFonts w:ascii="Times New Roman" w:hAnsi="Times New Roman" w:cs="Times New Roman"/>
-                <w:b/>
-                <w:bCs/>
-                <w:sz w:val="20"/>
-                <w:szCs w:val="20"/>
-              </w:rPr>
+            <w:r>
               <w:t>FK</w:t>
             </w:r>
           </w:p>
@@ -39223,20 +39066,7 @@
             <w:hideMark/>
           </w:tcPr>
           <w:p>
-            <w:pPr>
-              <w:spacing w:after="160" w:line="278" w:lineRule="auto"/>
-              <w:rPr>
-                <w:rFonts w:ascii="Times New Roman" w:hAnsi="Times New Roman" w:cs="Times New Roman"/>
-                <w:sz w:val="20"/>
-                <w:szCs w:val="20"/>
-              </w:rPr>
-            </w:pPr>
-            <w:r>
-              <w:rPr>
-                <w:rFonts w:ascii="Times New Roman" w:hAnsi="Times New Roman" w:cs="Times New Roman"/>
-                <w:sz w:val="20"/>
-                <w:szCs w:val="20"/>
-              </w:rPr>
+            <w:r>
               <w:t>NOT NULL</w:t>
             </w:r>
           </w:p>
@@ -39247,21 +39077,8 @@
             <w:hideMark/>
           </w:tcPr>
           <w:p>
-            <w:pPr>
-              <w:spacing w:after="160" w:line="278" w:lineRule="auto"/>
-              <w:rPr>
-                <w:rFonts w:ascii="Times New Roman" w:hAnsi="Times New Roman" w:cs="Times New Roman"/>
-                <w:sz w:val="20"/>
-                <w:szCs w:val="20"/>
-              </w:rPr>
-            </w:pPr>
-            <w:r>
-              <w:rPr>
-                <w:rFonts w:ascii="Times New Roman" w:hAnsi="Times New Roman" w:cs="Times New Roman"/>
-                <w:sz w:val="20"/>
-                <w:szCs w:val="20"/>
-              </w:rPr>
-              <w:t>Khóa ngoại liên kết INVOICES(invoice_id)</w:t>
+            <w:r>
+              <w:t>Khóa ngoại liên kết INVOICES(id)</w:t>
             </w:r>
           </w:p>
         </w:tc>
@@ -39273,68 +39090,29 @@
             <w:hideMark/>
           </w:tcPr>
           <w:p>
-            <w:pPr>
-              <w:spacing w:after="160" w:line="278" w:lineRule="auto"/>
-              <w:rPr>
-                <w:rFonts w:ascii="Times New Roman" w:hAnsi="Times New Roman" w:cs="Times New Roman"/>
-                <w:sz w:val="20"/>
-                <w:szCs w:val="20"/>
-              </w:rPr>
-            </w:pPr>
-            <w:r>
-              <w:rPr>
-                <w:rFonts w:ascii="Times New Roman" w:hAnsi="Times New Roman" w:cs="Times New Roman"/>
-                <w:sz w:val="20"/>
-                <w:szCs w:val="20"/>
-              </w:rPr>
-              <w:t>service_id</w:t>
-            </w:r>
-          </w:p>
-        </w:tc>
-        <w:tc>
-          <w:tcPr>
-            <w:tcW w:w="0" w:type="auto"/>
-            <w:hideMark/>
-          </w:tcPr>
-          <w:p>
-            <w:pPr>
-              <w:spacing w:after="160" w:line="278" w:lineRule="auto"/>
-              <w:rPr>
-                <w:rFonts w:ascii="Times New Roman" w:hAnsi="Times New Roman" w:cs="Times New Roman"/>
-                <w:sz w:val="20"/>
-                <w:szCs w:val="20"/>
-              </w:rPr>
-            </w:pPr>
-            <w:r>
-              <w:rPr>
-                <w:rFonts w:ascii="Times New Roman" w:hAnsi="Times New Roman" w:cs="Times New Roman"/>
-                <w:sz w:val="20"/>
-                <w:szCs w:val="20"/>
-              </w:rPr>
-              <w:t>INT</w:t>
-            </w:r>
-          </w:p>
-        </w:tc>
-        <w:tc>
-          <w:tcPr>
-            <w:tcW w:w="0" w:type="auto"/>
-            <w:hideMark/>
-          </w:tcPr>
-          <w:p>
-            <w:pPr>
-              <w:spacing w:after="160" w:line="278" w:lineRule="auto"/>
-              <w:rPr>
-                <w:rFonts w:ascii="Times New Roman" w:hAnsi="Times New Roman" w:cs="Times New Roman"/>
-                <w:sz w:val="20"/>
-                <w:szCs w:val="20"/>
-              </w:rPr>
-            </w:pPr>
-            <w:r>
-              <w:rPr>
-                <w:rFonts w:ascii="Times New Roman" w:hAnsi="Times New Roman" w:cs="Times New Roman"/>
-                <w:sz w:val="20"/>
-                <w:szCs w:val="20"/>
-              </w:rPr>
+            <w:r>
+              <w:t>amount</w:t>
+            </w:r>
+          </w:p>
+        </w:tc>
+        <w:tc>
+          <w:tcPr>
+            <w:tcW w:w="0" w:type="auto"/>
+            <w:hideMark/>
+          </w:tcPr>
+          <w:p>
+            <w:r>
+              <w:t>FLOAT</w:t>
+            </w:r>
+          </w:p>
+        </w:tc>
+        <w:tc>
+          <w:tcPr>
+            <w:tcW w:w="0" w:type="auto"/>
+            <w:hideMark/>
+          </w:tcPr>
+          <w:p>
+            <w:r>
               <w:t>–</w:t>
             </w:r>
           </w:p>
@@ -39345,46 +39123,18 @@
             <w:hideMark/>
           </w:tcPr>
           <w:p>
-            <w:pPr>
-              <w:spacing w:after="160" w:line="278" w:lineRule="auto"/>
-              <w:rPr>
-                <w:rFonts w:ascii="Times New Roman" w:hAnsi="Times New Roman" w:cs="Times New Roman"/>
-                <w:sz w:val="20"/>
-                <w:szCs w:val="20"/>
-              </w:rPr>
-            </w:pPr>
-            <w:r>
-              <w:rPr>
-                <w:rFonts w:ascii="Times New Roman" w:hAnsi="Times New Roman" w:cs="Times New Roman"/>
-                <w:b/>
-                <w:bCs/>
-                <w:sz w:val="20"/>
-                <w:szCs w:val="20"/>
-              </w:rPr>
-              <w:t>FK</w:t>
-            </w:r>
-          </w:p>
-        </w:tc>
-        <w:tc>
-          <w:tcPr>
-            <w:tcW w:w="0" w:type="auto"/>
-            <w:hideMark/>
-          </w:tcPr>
-          <w:p>
-            <w:pPr>
-              <w:spacing w:after="160" w:line="278" w:lineRule="auto"/>
-              <w:rPr>
-                <w:rFonts w:ascii="Times New Roman" w:hAnsi="Times New Roman" w:cs="Times New Roman"/>
-                <w:sz w:val="20"/>
-                <w:szCs w:val="20"/>
-              </w:rPr>
-            </w:pPr>
-            <w:r>
-              <w:rPr>
-                <w:rFonts w:ascii="Times New Roman" w:hAnsi="Times New Roman" w:cs="Times New Roman"/>
-                <w:sz w:val="20"/>
-                <w:szCs w:val="20"/>
-              </w:rPr>
+            <w:r>
+              <w:t>–</w:t>
+            </w:r>
+          </w:p>
+        </w:tc>
+        <w:tc>
+          <w:tcPr>
+            <w:tcW w:w="0" w:type="auto"/>
+            <w:hideMark/>
+          </w:tcPr>
+          <w:p>
+            <w:r>
               <w:t>NOT NULL</w:t>
             </w:r>
           </w:p>
@@ -39395,21 +39145,8 @@
             <w:hideMark/>
           </w:tcPr>
           <w:p>
-            <w:pPr>
-              <w:spacing w:after="160" w:line="278" w:lineRule="auto"/>
-              <w:rPr>
-                <w:rFonts w:ascii="Times New Roman" w:hAnsi="Times New Roman" w:cs="Times New Roman"/>
-                <w:sz w:val="20"/>
-                <w:szCs w:val="20"/>
-              </w:rPr>
-            </w:pPr>
-            <w:r>
-              <w:rPr>
-                <w:rFonts w:ascii="Times New Roman" w:hAnsi="Times New Roman" w:cs="Times New Roman"/>
-                <w:sz w:val="20"/>
-                <w:szCs w:val="20"/>
-              </w:rPr>
-              <w:t>Khóa ngoại liên kết SERVICES(service_id)</w:t>
+            <w:r>
+              <w:t>Số tiền thanh toán</w:t>
             </w:r>
           </w:p>
         </w:tc>
@@ -39421,68 +39158,40 @@
             <w:hideMark/>
           </w:tcPr>
           <w:p>
-            <w:pPr>
-              <w:spacing w:after="160" w:line="278" w:lineRule="auto"/>
-              <w:rPr>
-                <w:rFonts w:ascii="Times New Roman" w:hAnsi="Times New Roman" w:cs="Times New Roman"/>
-                <w:sz w:val="20"/>
-                <w:szCs w:val="20"/>
-              </w:rPr>
-            </w:pPr>
-            <w:r>
-              <w:rPr>
-                <w:rFonts w:ascii="Times New Roman" w:hAnsi="Times New Roman" w:cs="Times New Roman"/>
-                <w:sz w:val="20"/>
-                <w:szCs w:val="20"/>
-              </w:rPr>
-              <w:t>quantity</w:t>
-            </w:r>
-          </w:p>
-        </w:tc>
-        <w:tc>
-          <w:tcPr>
-            <w:tcW w:w="0" w:type="auto"/>
-            <w:hideMark/>
-          </w:tcPr>
-          <w:p>
-            <w:pPr>
-              <w:spacing w:after="160" w:line="278" w:lineRule="auto"/>
-              <w:rPr>
-                <w:rFonts w:ascii="Times New Roman" w:hAnsi="Times New Roman" w:cs="Times New Roman"/>
-                <w:sz w:val="20"/>
-                <w:szCs w:val="20"/>
-              </w:rPr>
-            </w:pPr>
-            <w:r>
-              <w:rPr>
-                <w:rFonts w:ascii="Times New Roman" w:hAnsi="Times New Roman" w:cs="Times New Roman"/>
-                <w:sz w:val="20"/>
-                <w:szCs w:val="20"/>
-              </w:rPr>
-              <w:t>INT</w:t>
-            </w:r>
-          </w:p>
-        </w:tc>
-        <w:tc>
-          <w:tcPr>
-            <w:tcW w:w="0" w:type="auto"/>
-            <w:hideMark/>
-          </w:tcPr>
-          <w:p>
-            <w:pPr>
-              <w:spacing w:after="160" w:line="278" w:lineRule="auto"/>
-              <w:rPr>
-                <w:rFonts w:ascii="Times New Roman" w:hAnsi="Times New Roman" w:cs="Times New Roman"/>
-                <w:sz w:val="20"/>
-                <w:szCs w:val="20"/>
-              </w:rPr>
-            </w:pPr>
-            <w:r>
-              <w:rPr>
-                <w:rFonts w:ascii="Times New Roman" w:hAnsi="Times New Roman" w:cs="Times New Roman"/>
-                <w:sz w:val="20"/>
-                <w:szCs w:val="20"/>
-              </w:rPr>
+            <w:r>
+              <w:t>payment_method</w:t>
+            </w:r>
+          </w:p>
+        </w:tc>
+        <w:tc>
+          <w:tcPr>
+            <w:tcW w:w="0" w:type="auto"/>
+            <w:hideMark/>
+          </w:tcPr>
+          <w:p>
+            <w:r>
+              <w:t>VARCHAR</w:t>
+            </w:r>
+          </w:p>
+        </w:tc>
+        <w:tc>
+          <w:tcPr>
+            <w:tcW w:w="0" w:type="auto"/>
+            <w:hideMark/>
+          </w:tcPr>
+          <w:p>
+            <w:r>
+              <w:t>50</w:t>
+            </w:r>
+          </w:p>
+        </w:tc>
+        <w:tc>
+          <w:tcPr>
+            <w:tcW w:w="0" w:type="auto"/>
+            <w:hideMark/>
+          </w:tcPr>
+          <w:p>
+            <w:r>
               <w:t>–</w:t>
             </w:r>
           </w:p>
@@ -39493,44 +39202,7 @@
             <w:hideMark/>
           </w:tcPr>
           <w:p>
-            <w:pPr>
-              <w:spacing w:after="160" w:line="278" w:lineRule="auto"/>
-              <w:rPr>
-                <w:rFonts w:ascii="Times New Roman" w:hAnsi="Times New Roman" w:cs="Times New Roman"/>
-                <w:sz w:val="20"/>
-                <w:szCs w:val="20"/>
-              </w:rPr>
-            </w:pPr>
-            <w:r>
-              <w:rPr>
-                <w:rFonts w:ascii="Times New Roman" w:hAnsi="Times New Roman" w:cs="Times New Roman"/>
-                <w:sz w:val="20"/>
-                <w:szCs w:val="20"/>
-              </w:rPr>
-              <w:t>–</w:t>
-            </w:r>
-          </w:p>
-        </w:tc>
-        <w:tc>
-          <w:tcPr>
-            <w:tcW w:w="0" w:type="auto"/>
-            <w:hideMark/>
-          </w:tcPr>
-          <w:p>
-            <w:pPr>
-              <w:spacing w:after="160" w:line="278" w:lineRule="auto"/>
-              <w:rPr>
-                <w:rFonts w:ascii="Times New Roman" w:hAnsi="Times New Roman" w:cs="Times New Roman"/>
-                <w:sz w:val="20"/>
-                <w:szCs w:val="20"/>
-              </w:rPr>
-            </w:pPr>
-            <w:r>
-              <w:rPr>
-                <w:rFonts w:ascii="Times New Roman" w:hAnsi="Times New Roman" w:cs="Times New Roman"/>
-                <w:sz w:val="20"/>
-                <w:szCs w:val="20"/>
-              </w:rPr>
+            <w:r>
               <w:t>NOT NULL</w:t>
             </w:r>
           </w:p>
@@ -39541,21 +39213,8 @@
             <w:hideMark/>
           </w:tcPr>
           <w:p>
-            <w:pPr>
-              <w:spacing w:after="160" w:line="278" w:lineRule="auto"/>
-              <w:rPr>
-                <w:rFonts w:ascii="Times New Roman" w:hAnsi="Times New Roman" w:cs="Times New Roman"/>
-                <w:sz w:val="20"/>
-                <w:szCs w:val="20"/>
-              </w:rPr>
-            </w:pPr>
-            <w:r>
-              <w:rPr>
-                <w:rFonts w:ascii="Times New Roman" w:hAnsi="Times New Roman" w:cs="Times New Roman"/>
-                <w:sz w:val="20"/>
-                <w:szCs w:val="20"/>
-              </w:rPr>
-              <w:t>Số lượng dịch vụ</w:t>
+            <w:r>
+              <w:t>Phương thức thanh toán</w:t>
             </w:r>
           </w:p>
         </w:tc>
@@ -39567,92 +39226,40 @@
             <w:hideMark/>
           </w:tcPr>
           <w:p>
-            <w:pPr>
-              <w:spacing w:after="160" w:line="278" w:lineRule="auto"/>
-              <w:rPr>
-                <w:rFonts w:ascii="Times New Roman" w:hAnsi="Times New Roman" w:cs="Times New Roman"/>
-                <w:sz w:val="20"/>
-                <w:szCs w:val="20"/>
-              </w:rPr>
-            </w:pPr>
-            <w:r>
-              <w:rPr>
-                <w:rFonts w:ascii="Times New Roman" w:hAnsi="Times New Roman" w:cs="Times New Roman"/>
-                <w:sz w:val="20"/>
-                <w:szCs w:val="20"/>
-              </w:rPr>
-              <w:t>unit_price</w:t>
-            </w:r>
-          </w:p>
-        </w:tc>
-        <w:tc>
-          <w:tcPr>
-            <w:tcW w:w="0" w:type="auto"/>
-            <w:hideMark/>
-          </w:tcPr>
-          <w:p>
-            <w:pPr>
-              <w:spacing w:after="160" w:line="278" w:lineRule="auto"/>
-              <w:rPr>
-                <w:rFonts w:ascii="Times New Roman" w:hAnsi="Times New Roman" w:cs="Times New Roman"/>
-                <w:sz w:val="20"/>
-                <w:szCs w:val="20"/>
-              </w:rPr>
-            </w:pPr>
-            <w:r>
-              <w:rPr>
-                <w:rFonts w:ascii="Times New Roman" w:hAnsi="Times New Roman" w:cs="Times New Roman"/>
-                <w:sz w:val="20"/>
-                <w:szCs w:val="20"/>
-              </w:rPr>
-              <w:t>DECIMAL</w:t>
-            </w:r>
-          </w:p>
-        </w:tc>
-        <w:tc>
-          <w:tcPr>
-            <w:tcW w:w="0" w:type="auto"/>
-            <w:hideMark/>
-          </w:tcPr>
-          <w:p>
-            <w:pPr>
-              <w:spacing w:after="160" w:line="278" w:lineRule="auto"/>
-              <w:rPr>
-                <w:rFonts w:ascii="Times New Roman" w:hAnsi="Times New Roman" w:cs="Times New Roman"/>
-                <w:sz w:val="20"/>
-                <w:szCs w:val="20"/>
-              </w:rPr>
-            </w:pPr>
-            <w:r>
-              <w:rPr>
-                <w:rFonts w:ascii="Times New Roman" w:hAnsi="Times New Roman" w:cs="Times New Roman"/>
-                <w:sz w:val="20"/>
-                <w:szCs w:val="20"/>
-              </w:rPr>
-              <w:t>12,2</w:t>
-            </w:r>
-          </w:p>
-        </w:tc>
-        <w:tc>
-          <w:tcPr>
-            <w:tcW w:w="0" w:type="auto"/>
-            <w:hideMark/>
-          </w:tcPr>
-          <w:p>
-            <w:pPr>
-              <w:spacing w:after="160" w:line="278" w:lineRule="auto"/>
-              <w:rPr>
-                <w:rFonts w:ascii="Times New Roman" w:hAnsi="Times New Roman" w:cs="Times New Roman"/>
-                <w:sz w:val="20"/>
-                <w:szCs w:val="20"/>
-              </w:rPr>
-            </w:pPr>
-            <w:r>
-              <w:rPr>
-                <w:rFonts w:ascii="Times New Roman" w:hAnsi="Times New Roman" w:cs="Times New Roman"/>
-                <w:sz w:val="20"/>
-                <w:szCs w:val="20"/>
-              </w:rPr>
+            <w:r>
+              <w:t>payment_status</w:t>
+            </w:r>
+          </w:p>
+        </w:tc>
+        <w:tc>
+          <w:tcPr>
+            <w:tcW w:w="0" w:type="auto"/>
+            <w:hideMark/>
+          </w:tcPr>
+          <w:p>
+            <w:r>
+              <w:t>VARCHAR</w:t>
+            </w:r>
+          </w:p>
+        </w:tc>
+        <w:tc>
+          <w:tcPr>
+            <w:tcW w:w="0" w:type="auto"/>
+            <w:hideMark/>
+          </w:tcPr>
+          <w:p>
+            <w:r>
+              <w:t>50</w:t>
+            </w:r>
+          </w:p>
+        </w:tc>
+        <w:tc>
+          <w:tcPr>
+            <w:tcW w:w="0" w:type="auto"/>
+            <w:hideMark/>
+          </w:tcPr>
+          <w:p>
+            <w:r>
               <w:t>–</w:t>
             </w:r>
           </w:p>
@@ -39663,20 +39270,7 @@
             <w:hideMark/>
           </w:tcPr>
           <w:p>
-            <w:pPr>
-              <w:spacing w:after="160" w:line="278" w:lineRule="auto"/>
-              <w:rPr>
-                <w:rFonts w:ascii="Times New Roman" w:hAnsi="Times New Roman" w:cs="Times New Roman"/>
-                <w:sz w:val="20"/>
-                <w:szCs w:val="20"/>
-              </w:rPr>
-            </w:pPr>
-            <w:r>
-              <w:rPr>
-                <w:rFonts w:ascii="Times New Roman" w:hAnsi="Times New Roman" w:cs="Times New Roman"/>
-                <w:sz w:val="20"/>
-                <w:szCs w:val="20"/>
-              </w:rPr>
+            <w:r>
               <w:t>NOT NULL</w:t>
             </w:r>
           </w:p>
@@ -39687,21 +39281,8 @@
             <w:hideMark/>
           </w:tcPr>
           <w:p>
-            <w:pPr>
-              <w:spacing w:after="160" w:line="278" w:lineRule="auto"/>
-              <w:rPr>
-                <w:rFonts w:ascii="Times New Roman" w:hAnsi="Times New Roman" w:cs="Times New Roman"/>
-                <w:sz w:val="20"/>
-                <w:szCs w:val="20"/>
-              </w:rPr>
-            </w:pPr>
-            <w:r>
-              <w:rPr>
-                <w:rFonts w:ascii="Times New Roman" w:hAnsi="Times New Roman" w:cs="Times New Roman"/>
-                <w:sz w:val="20"/>
-                <w:szCs w:val="20"/>
-              </w:rPr>
-              <w:t>Đơn giá của dịch vụ tại thời điểm lập hóa đơn</w:t>
+            <w:r>
+              <w:t>Trạng thái thanh toán</w:t>
             </w:r>
           </w:p>
         </w:tc>
@@ -39713,92 +39294,40 @@
             <w:hideMark/>
           </w:tcPr>
           <w:p>
-            <w:pPr>
-              <w:spacing w:after="160" w:line="278" w:lineRule="auto"/>
-              <w:rPr>
-                <w:rFonts w:ascii="Times New Roman" w:hAnsi="Times New Roman" w:cs="Times New Roman"/>
-                <w:sz w:val="20"/>
-                <w:szCs w:val="20"/>
-              </w:rPr>
-            </w:pPr>
-            <w:r>
-              <w:rPr>
-                <w:rFonts w:ascii="Times New Roman" w:hAnsi="Times New Roman" w:cs="Times New Roman"/>
-                <w:sz w:val="20"/>
-                <w:szCs w:val="20"/>
-              </w:rPr>
-              <w:t>amount</w:t>
-            </w:r>
-          </w:p>
-        </w:tc>
-        <w:tc>
-          <w:tcPr>
-            <w:tcW w:w="0" w:type="auto"/>
-            <w:hideMark/>
-          </w:tcPr>
-          <w:p>
-            <w:pPr>
-              <w:spacing w:after="160" w:line="278" w:lineRule="auto"/>
-              <w:rPr>
-                <w:rFonts w:ascii="Times New Roman" w:hAnsi="Times New Roman" w:cs="Times New Roman"/>
-                <w:sz w:val="20"/>
-                <w:szCs w:val="20"/>
-              </w:rPr>
-            </w:pPr>
-            <w:r>
-              <w:rPr>
-                <w:rFonts w:ascii="Times New Roman" w:hAnsi="Times New Roman" w:cs="Times New Roman"/>
-                <w:sz w:val="20"/>
-                <w:szCs w:val="20"/>
-              </w:rPr>
-              <w:t>DECIMAL</w:t>
-            </w:r>
-          </w:p>
-        </w:tc>
-        <w:tc>
-          <w:tcPr>
-            <w:tcW w:w="0" w:type="auto"/>
-            <w:hideMark/>
-          </w:tcPr>
-          <w:p>
-            <w:pPr>
-              <w:spacing w:after="160" w:line="278" w:lineRule="auto"/>
-              <w:rPr>
-                <w:rFonts w:ascii="Times New Roman" w:hAnsi="Times New Roman" w:cs="Times New Roman"/>
-                <w:sz w:val="20"/>
-                <w:szCs w:val="20"/>
-              </w:rPr>
-            </w:pPr>
-            <w:r>
-              <w:rPr>
-                <w:rFonts w:ascii="Times New Roman" w:hAnsi="Times New Roman" w:cs="Times New Roman"/>
-                <w:sz w:val="20"/>
-                <w:szCs w:val="20"/>
-              </w:rPr>
-              <w:t>12,2</w:t>
-            </w:r>
-          </w:p>
-        </w:tc>
-        <w:tc>
-          <w:tcPr>
-            <w:tcW w:w="0" w:type="auto"/>
-            <w:hideMark/>
-          </w:tcPr>
-          <w:p>
-            <w:pPr>
-              <w:spacing w:after="160" w:line="278" w:lineRule="auto"/>
-              <w:rPr>
-                <w:rFonts w:ascii="Times New Roman" w:hAnsi="Times New Roman" w:cs="Times New Roman"/>
-                <w:sz w:val="20"/>
-                <w:szCs w:val="20"/>
-              </w:rPr>
-            </w:pPr>
-            <w:r>
-              <w:rPr>
-                <w:rFonts w:ascii="Times New Roman" w:hAnsi="Times New Roman" w:cs="Times New Roman"/>
-                <w:sz w:val="20"/>
-                <w:szCs w:val="20"/>
-              </w:rPr>
+            <w:r>
+              <w:t>transaction_code</w:t>
+            </w:r>
+          </w:p>
+        </w:tc>
+        <w:tc>
+          <w:tcPr>
+            <w:tcW w:w="0" w:type="auto"/>
+            <w:hideMark/>
+          </w:tcPr>
+          <w:p>
+            <w:r>
+              <w:t>VARCHAR</w:t>
+            </w:r>
+          </w:p>
+        </w:tc>
+        <w:tc>
+          <w:tcPr>
+            <w:tcW w:w="0" w:type="auto"/>
+            <w:hideMark/>
+          </w:tcPr>
+          <w:p>
+            <w:r>
+              <w:t>100</w:t>
+            </w:r>
+          </w:p>
+        </w:tc>
+        <w:tc>
+          <w:tcPr>
+            <w:tcW w:w="0" w:type="auto"/>
+            <w:hideMark/>
+          </w:tcPr>
+          <w:p>
+            <w:r>
               <w:t>–</w:t>
             </w:r>
           </w:p>
@@ -39809,45 +39338,81 @@
             <w:hideMark/>
           </w:tcPr>
           <w:p>
-            <w:pPr>
-              <w:spacing w:after="160" w:line="278" w:lineRule="auto"/>
-              <w:rPr>
-                <w:rFonts w:ascii="Times New Roman" w:hAnsi="Times New Roman" w:cs="Times New Roman"/>
-                <w:sz w:val="20"/>
-                <w:szCs w:val="20"/>
-              </w:rPr>
-            </w:pPr>
-            <w:r>
-              <w:rPr>
-                <w:rFonts w:ascii="Times New Roman" w:hAnsi="Times New Roman" w:cs="Times New Roman"/>
-                <w:sz w:val="20"/>
-                <w:szCs w:val="20"/>
-              </w:rPr>
-              <w:t>NOT NULL</w:t>
-            </w:r>
-          </w:p>
-        </w:tc>
-        <w:tc>
-          <w:tcPr>
-            <w:tcW w:w="0" w:type="auto"/>
-            <w:hideMark/>
-          </w:tcPr>
-          <w:p>
-            <w:pPr>
-              <w:spacing w:after="160" w:line="278" w:lineRule="auto"/>
-              <w:rPr>
-                <w:rFonts w:ascii="Times New Roman" w:hAnsi="Times New Roman" w:cs="Times New Roman"/>
-                <w:sz w:val="20"/>
-                <w:szCs w:val="20"/>
-              </w:rPr>
-            </w:pPr>
-            <w:r>
-              <w:rPr>
-                <w:rFonts w:ascii="Times New Roman" w:hAnsi="Times New Roman" w:cs="Times New Roman"/>
-                <w:sz w:val="20"/>
-                <w:szCs w:val="20"/>
-              </w:rPr>
-              <w:t>Thành tiền của dòng hóa đơn (quantity × unit_price)</w:t>
+            <w:r>
+              <w:t>NULL</w:t>
+            </w:r>
+          </w:p>
+        </w:tc>
+        <w:tc>
+          <w:tcPr>
+            <w:tcW w:w="0" w:type="auto"/>
+            <w:hideMark/>
+          </w:tcPr>
+          <w:p>
+            <w:r>
+              <w:t>Mã tham chiếu</w:t>
+            </w:r>
+          </w:p>
+        </w:tc>
+      </w:tr>
+      <w:tr>
+        <w:tc>
+          <w:tcPr>
+            <w:tcW w:type="dxa" w:w="1061"/>
+          </w:tcPr>
+          <w:p>
+            <w:r>
+              <w:t>paid_at</w:t>
+            </w:r>
+          </w:p>
+        </w:tc>
+        <w:tc>
+          <w:tcPr>
+            <w:tcW w:type="dxa" w:w="1251"/>
+          </w:tcPr>
+          <w:p>
+            <w:r>
+              <w:t>DATETIME</w:t>
+            </w:r>
+          </w:p>
+        </w:tc>
+        <w:tc>
+          <w:tcPr>
+            <w:tcW w:type="dxa" w:w="1112"/>
+          </w:tcPr>
+          <w:p>
+            <w:r>
+              <w:t>–</w:t>
+            </w:r>
+          </w:p>
+        </w:tc>
+        <w:tc>
+          <w:tcPr>
+            <w:tcW w:type="dxa" w:w="683"/>
+          </w:tcPr>
+          <w:p>
+            <w:r>
+              <w:t>–</w:t>
+            </w:r>
+          </w:p>
+        </w:tc>
+        <w:tc>
+          <w:tcPr>
+            <w:tcW w:type="dxa" w:w="1144"/>
+          </w:tcPr>
+          <w:p>
+            <w:r>
+              <w:t>NULL</w:t>
+            </w:r>
+          </w:p>
+        </w:tc>
+        <w:tc>
+          <w:tcPr>
+            <w:tcW w:type="dxa" w:w="4099"/>
+          </w:tcPr>
+          <w:p>
+            <w:r>
+              <w:t>Thời gian thanh toán</w:t>
             </w:r>
           </w:p>
         </w:tc>
@@ -41243,12 +40808,7 @@
         </w:rPr>
       </w:pPr>
       <w:r>
-        <w:rPr>
-          <w:rFonts w:ascii="Times New Roman" w:hAnsi="Times New Roman" w:cs="Times New Roman"/>
-          <w:sz w:val="28"/>
-          <w:szCs w:val="28"/>
-        </w:rPr>
-        <w:t>INVOICE_DETAILS.invoice_id tham chiếu đến INVOICES(invoice_id).</w:t>
+        <w:t>PAYMENTS.invoice_id tham chiếu đến INVOICES(id).</w:t>
       </w:r>
     </w:p>
     <w:p>
@@ -41263,14 +40823,7 @@
           <w:szCs w:val="28"/>
         </w:rPr>
       </w:pPr>
-      <w:r>
-        <w:rPr>
-          <w:rFonts w:ascii="Times New Roman" w:hAnsi="Times New Roman" w:cs="Times New Roman"/>
-          <w:sz w:val="28"/>
-          <w:szCs w:val="28"/>
-        </w:rPr>
-        <w:t>INVOICE_DETAILS.service_id tham chiếu đến SERVICES(service_id).</w:t>
-      </w:r>
+      <w:r/>
     </w:p>
     <w:p>
       <w:pPr>
@@ -41474,14 +41027,7 @@
           <w:szCs w:val="28"/>
         </w:rPr>
       </w:pPr>
-      <w:r>
-        <w:rPr>
-          <w:rFonts w:ascii="Times New Roman" w:hAnsi="Times New Roman" w:cs="Times New Roman"/>
-          <w:sz w:val="28"/>
-          <w:szCs w:val="28"/>
-        </w:rPr>
-        <w:t>INVOICE_DETAILS.quantity &gt; 0.</w:t>
-      </w:r>
+      <w:r/>
     </w:p>
     <w:p>
       <w:pPr>
@@ -41495,14 +41041,7 @@
           <w:szCs w:val="28"/>
         </w:rPr>
       </w:pPr>
-      <w:r>
-        <w:rPr>
-          <w:rFonts w:ascii="Times New Roman" w:hAnsi="Times New Roman" w:cs="Times New Roman"/>
-          <w:sz w:val="28"/>
-          <w:szCs w:val="28"/>
-        </w:rPr>
-        <w:t>INVOICE_DETAILS.unit_price &gt;= 0.</w:t>
-      </w:r>
+      <w:r/>
     </w:p>
     <w:p>
       <w:pPr>
@@ -41516,14 +41055,7 @@
           <w:szCs w:val="28"/>
         </w:rPr>
       </w:pPr>
-      <w:r>
-        <w:rPr>
-          <w:rFonts w:ascii="Times New Roman" w:hAnsi="Times New Roman" w:cs="Times New Roman"/>
-          <w:sz w:val="28"/>
-          <w:szCs w:val="28"/>
-        </w:rPr>
-        <w:t>INVOICE_DETAILS.amount &gt;= 0.</w:t>
-      </w:r>
+      <w:r/>
     </w:p>
     <w:p>
       <w:pPr>
@@ -42088,12 +41620,7 @@
         </w:rPr>
       </w:pPr>
       <w:r>
-        <w:rPr>
-          <w:rFonts w:ascii="Times New Roman" w:hAnsi="Times New Roman" w:cs="Times New Roman"/>
-          <w:sz w:val="28"/>
-          <w:szCs w:val="28"/>
-        </w:rPr>
-        <w:t>role: VARCHAR(20), vai trò (MANAGER, RECEPTIONIST, HAIRDRESSER).</w:t>
+        <w:t>role_id: Khóa ngoại tham chiếu bảng ROLES để phân quyền theo RBAC.</w:t>
       </w:r>
     </w:p>
     <w:p>

</xml_diff>

<commit_message>
docs: align AI logs documentation
</commit_message>
<xml_diff>
--- a/BaoCaoMoi (1).docx
+++ b/BaoCaoMoi (1).docx
@@ -6508,6 +6508,294 @@
     </w:p>
     <w:p>
       <w:pPr>
+        <w:pStyle w:val="Heading3"/>
+      </w:pPr>
+      <w:r>
+        <w:t>Kiểm thử AI_LOGS</w:t>
+      </w:r>
+    </w:p>
+    <w:p>
+      <w:r>
+        <w:t>Kết quả tổng thể: 27 passed / 0 failed</w:t>
+      </w:r>
+    </w:p>
+    <w:tbl>
+      <w:tblPr>
+        <w:tblStyle w:val="TableGrid"/>
+        <w:tblW w:type="auto" w:w="0"/>
+        <w:tblLook w:firstColumn="1" w:firstRow="1" w:lastColumn="0" w:lastRow="0" w:noHBand="0" w:noVBand="1" w:val="04A0"/>
+      </w:tblPr>
+      <w:tblGrid>
+        <w:gridCol w:w="4680"/>
+        <w:gridCol w:w="4680"/>
+      </w:tblGrid>
+      <w:tr>
+        <w:tc>
+          <w:tcPr>
+            <w:tcW w:type="dxa" w:w="4680"/>
+          </w:tcPr>
+          <w:p>
+            <w:r>
+              <w:t>Test area</w:t>
+            </w:r>
+          </w:p>
+        </w:tc>
+        <w:tc>
+          <w:tcPr>
+            <w:tcW w:type="dxa" w:w="4680"/>
+          </w:tcPr>
+          <w:p>
+            <w:r>
+              <w:t>Result</w:t>
+            </w:r>
+          </w:p>
+        </w:tc>
+      </w:tr>
+      <w:tr>
+        <w:tc>
+          <w:tcPr>
+            <w:tcW w:type="dxa" w:w="4680"/>
+          </w:tcPr>
+          <w:p>
+            <w:r>
+              <w:t>AI log persistence</w:t>
+            </w:r>
+          </w:p>
+        </w:tc>
+        <w:tc>
+          <w:tcPr>
+            <w:tcW w:type="dxa" w:w="4680"/>
+          </w:tcPr>
+          <w:p>
+            <w:r>
+              <w:t>PASS</w:t>
+            </w:r>
+          </w:p>
+        </w:tc>
+      </w:tr>
+      <w:tr>
+        <w:tc>
+          <w:tcPr>
+            <w:tcW w:type="dxa" w:w="4680"/>
+          </w:tcPr>
+          <w:p>
+            <w:r>
+              <w:t>SUCCESS logging</w:t>
+            </w:r>
+          </w:p>
+        </w:tc>
+        <w:tc>
+          <w:tcPr>
+            <w:tcW w:type="dxa" w:w="4680"/>
+          </w:tcPr>
+          <w:p>
+            <w:r>
+              <w:t>PASS</w:t>
+            </w:r>
+          </w:p>
+        </w:tc>
+      </w:tr>
+      <w:tr>
+        <w:tc>
+          <w:tcPr>
+            <w:tcW w:type="dxa" w:w="4680"/>
+          </w:tcPr>
+          <w:p>
+            <w:r>
+              <w:t>FALLBACK logging</w:t>
+            </w:r>
+          </w:p>
+        </w:tc>
+        <w:tc>
+          <w:tcPr>
+            <w:tcW w:type="dxa" w:w="4680"/>
+          </w:tcPr>
+          <w:p>
+            <w:r>
+              <w:t>PASS</w:t>
+            </w:r>
+          </w:p>
+        </w:tc>
+      </w:tr>
+      <w:tr>
+        <w:tc>
+          <w:tcPr>
+            <w:tcW w:type="dxa" w:w="4680"/>
+          </w:tcPr>
+          <w:p>
+            <w:r>
+              <w:t>JSON parsing failure → FALLBACK</w:t>
+            </w:r>
+          </w:p>
+        </w:tc>
+        <w:tc>
+          <w:tcPr>
+            <w:tcW w:type="dxa" w:w="4680"/>
+          </w:tcPr>
+          <w:p>
+            <w:r>
+              <w:t>PASS</w:t>
+            </w:r>
+          </w:p>
+        </w:tc>
+      </w:tr>
+      <w:tr>
+        <w:tc>
+          <w:tcPr>
+            <w:tcW w:type="dxa" w:w="4680"/>
+          </w:tcPr>
+          <w:p>
+            <w:r>
+              <w:t>ERROR logging</w:t>
+            </w:r>
+          </w:p>
+        </w:tc>
+        <w:tc>
+          <w:tcPr>
+            <w:tcW w:type="dxa" w:w="4680"/>
+          </w:tcPr>
+          <w:p>
+            <w:r>
+              <w:t>PASS</w:t>
+            </w:r>
+          </w:p>
+        </w:tc>
+      </w:tr>
+      <w:tr>
+        <w:tc>
+          <w:tcPr>
+            <w:tcW w:type="dxa" w:w="4680"/>
+          </w:tcPr>
+          <w:p>
+            <w:r>
+              <w:t>user_id persistence</w:t>
+            </w:r>
+          </w:p>
+        </w:tc>
+        <w:tc>
+          <w:tcPr>
+            <w:tcW w:type="dxa" w:w="4680"/>
+          </w:tcPr>
+          <w:p>
+            <w:r>
+              <w:t>PASS</w:t>
+            </w:r>
+          </w:p>
+        </w:tc>
+      </w:tr>
+      <w:tr>
+        <w:tc>
+          <w:tcPr>
+            <w:tcW w:type="dxa" w:w="4680"/>
+          </w:tcPr>
+          <w:p>
+            <w:r>
+              <w:t>customer_id persistence</w:t>
+            </w:r>
+          </w:p>
+        </w:tc>
+        <w:tc>
+          <w:tcPr>
+            <w:tcW w:type="dxa" w:w="4680"/>
+          </w:tcPr>
+          <w:p>
+            <w:r>
+              <w:t>PASS</w:t>
+            </w:r>
+          </w:p>
+        </w:tc>
+      </w:tr>
+      <w:tr>
+        <w:tc>
+          <w:tcPr>
+            <w:tcW w:type="dxa" w:w="4680"/>
+          </w:tcPr>
+          <w:p>
+            <w:r>
+              <w:t>Sensitive data protection</w:t>
+            </w:r>
+          </w:p>
+        </w:tc>
+        <w:tc>
+          <w:tcPr>
+            <w:tcW w:type="dxa" w:w="4680"/>
+          </w:tcPr>
+          <w:p>
+            <w:r>
+              <w:t>PASS</w:t>
+            </w:r>
+          </w:p>
+        </w:tc>
+      </w:tr>
+      <w:tr>
+        <w:tc>
+          <w:tcPr>
+            <w:tcW w:type="dxa" w:w="4680"/>
+          </w:tcPr>
+          <w:p>
+            <w:r>
+              <w:t>JWT/access token protection</w:t>
+            </w:r>
+          </w:p>
+        </w:tc>
+        <w:tc>
+          <w:tcPr>
+            <w:tcW w:type="dxa" w:w="4680"/>
+          </w:tcPr>
+          <w:p>
+            <w:r>
+              <w:t>PASS</w:t>
+            </w:r>
+          </w:p>
+        </w:tc>
+      </w:tr>
+      <w:tr>
+        <w:tc>
+          <w:tcPr>
+            <w:tcW w:type="dxa" w:w="4680"/>
+          </w:tcPr>
+          <w:p>
+            <w:r>
+              <w:t>Authorization header protection</w:t>
+            </w:r>
+          </w:p>
+        </w:tc>
+        <w:tc>
+          <w:tcPr>
+            <w:tcW w:type="dxa" w:w="4680"/>
+          </w:tcPr>
+          <w:p>
+            <w:r>
+              <w:t>PASS</w:t>
+            </w:r>
+          </w:p>
+        </w:tc>
+      </w:tr>
+      <w:tr>
+        <w:tc>
+          <w:tcPr>
+            <w:tcW w:type="dxa" w:w="4680"/>
+          </w:tcPr>
+          <w:p>
+            <w:r>
+              <w:t>Password protection</w:t>
+            </w:r>
+          </w:p>
+        </w:tc>
+        <w:tc>
+          <w:tcPr>
+            <w:tcW w:type="dxa" w:w="4680"/>
+          </w:tcPr>
+          <w:p>
+            <w:r>
+              <w:t>PASS</w:t>
+            </w:r>
+          </w:p>
+        </w:tc>
+      </w:tr>
+    </w:tbl>
+    <w:p>
+      <w:pPr>
         <w:rPr>
           <w:rFonts w:ascii="Times New Roman" w:hAnsi="Times New Roman" w:cs="Times New Roman"/>
           <w:b/>
@@ -6593,6 +6881,67 @@
           <w:szCs w:val="28"/>
         </w:rPr>
         <w:t>Hệ thống tích hợp AI thông qua Gemini API nhằm hỗ trợ ba nhóm chức năng chính:</w:t>
+      </w:r>
+    </w:p>
+    <w:p>
+      <w:pPr>
+        <w:pStyle w:val="Heading3"/>
+      </w:pPr>
+      <w:r>
+        <w:t>Kiến trúc AI (AI Architecture &amp; Flow):</w:t>
+      </w:r>
+    </w:p>
+    <w:p>
+      <w:r>
+        <w:t>Client → AI Router → AIService → Gemini → Parsing / Catalog Validation → Fallback nếu cần → Xác định SUCCESS / FALLBACK / ERROR → Save AI_LOGS → Return Response.</w:t>
+      </w:r>
+    </w:p>
+    <w:p>
+      <w:r>
+        <w:t>1. Client gửi yêu cầu.</w:t>
+        <w:br/>
+        <w:t>2. Router tiếp nhận.</w:t>
+        <w:br/>
+        <w:t>3. AIService xử lý nghiệp vụ.</w:t>
+        <w:br/>
+        <w:t>4. Gemini được gọi để sinh response.</w:t>
+        <w:br/>
+        <w:t>5. Response được parse và kiểm tra.</w:t>
+        <w:br/>
+        <w:t>6. Catalog guard đảm bảo recommendation phù hợp service catalog.</w:t>
+        <w:br/>
+        <w:t>7. Nếu Gemini không tạo được output hợp lệ, fallback được sử dụng.</w:t>
+        <w:br/>
+        <w:t>8. Hệ thống xác định trạng thái.</w:t>
+        <w:br/>
+        <w:t>9. Ghi AI_LOGS.</w:t>
+        <w:br/>
+        <w:t>10. Trả kết quả cho client.</w:t>
+      </w:r>
+    </w:p>
+    <w:p>
+      <w:r>
+        <w:t>Status Semantics:</w:t>
+      </w:r>
+    </w:p>
+    <w:p>
+      <w:r>
+        <w:t>- SUCCESS: Gemini trả response hợp lệ và vượt qua parsing/catalog validation.</w:t>
+      </w:r>
+    </w:p>
+    <w:p>
+      <w:r>
+        <w:t>- FALLBACK: Gemini không tạo response hợp lệ hoặc output không parse/validation được, hệ thống sử dụng fallback.</w:t>
+      </w:r>
+    </w:p>
+    <w:p>
+      <w:r>
+        <w:t>- ERROR: Request không thể tạo response cuối cùng hợp lệ hoặc phát sinh lỗi khiến quá trình xử lý thất bại.</w:t>
+      </w:r>
+    </w:p>
+    <w:p>
+      <w:r>
+        <w:t>Lưu ý quan trọng: Việc ghi AI_LOGS được xử lý độc lập với kết quả AI chính. Nếu thao tác ghi log phát sinh lỗi, exception được xử lý và transaction được rollback để tránh làm request AI chính bị crash.</w:t>
       </w:r>
     </w:p>
     <w:p>
@@ -10604,6 +10953,21 @@
           <w:szCs w:val="28"/>
         </w:rPr>
         <w:t xml:space="preserve"> API Key của Gemini được lưu trữ và sử dụng tại Backend, không đưa trực tiếp vào mã nguồn Frontend hoặc giao diện người dùng.</w:t>
+      </w:r>
+    </w:p>
+    <w:p>
+      <w:r>
+        <w:t>Bảo mật AI_LOGS:</w:t>
+      </w:r>
+    </w:p>
+    <w:p>
+      <w:r>
+        <w:t>AI_LOGS không được lưu: Gemini API key, JWT/access token, Authorization header, password.</w:t>
+      </w:r>
+    </w:p>
+    <w:p>
+      <w:r>
+        <w:t>Dữ liệu log chỉ phục vụ audit/debug/monitoring và không lưu credentials hoặc authentication secrets.</w:t>
       </w:r>
     </w:p>
     <w:p>
@@ -20817,6 +21181,16 @@
       </w:r>
     </w:p>
     <w:p>
+      <w:r>
+        <w:t>Khởi tạo Cơ sở dữ liệu (Database Initialization):</w:t>
+      </w:r>
+    </w:p>
+    <w:p>
+      <w:r>
+        <w:t>Project hiện tại không sử dụng Alembic. Các model được đăng ký vào SQLAlchemy metadata và database schema được khởi tạo thông qua `Base.metadata.create_all(bind=engine)`.</w:t>
+      </w:r>
+    </w:p>
+    <w:p>
       <w:pPr>
         <w:numPr>
           <w:ilvl w:val="0"/>
@@ -24824,6 +25198,652 @@
         <w:t>MỤC 4: SCREEN FLOW &amp; TÀI LIỆU THIẾT KẾ CƠ SỞ DỮ LIỆU</w:t>
       </w:r>
     </w:p>
+    <w:p>
+      <w:pPr>
+        <w:pStyle w:val="Heading3"/>
+      </w:pPr>
+      <w:r>
+        <w:t>Bảng: AI_LOGS</w:t>
+      </w:r>
+    </w:p>
+    <w:p/>
+    <w:p>
+      <w:r>
+        <w:t>Quan hệ (Relationships):</w:t>
+      </w:r>
+    </w:p>
+    <w:p>
+      <w:r>
+        <w:t>USERS 1 ─── N AI_LOGS</w:t>
+      </w:r>
+    </w:p>
+    <w:p>
+      <w:r>
+        <w:t>CUSTOMERS 1 ─── N AI_LOGS</w:t>
+      </w:r>
+    </w:p>
+    <w:tbl>
+      <w:tblPr>
+        <w:tblStyle w:val="TableGrid"/>
+        <w:tblW w:type="auto" w:w="0"/>
+        <w:tblLook w:firstColumn="1" w:firstRow="1" w:lastColumn="0" w:lastRow="0" w:noHBand="0" w:noVBand="1" w:val="04A0"/>
+      </w:tblPr>
+      <w:tblGrid>
+        <w:gridCol w:w="1872"/>
+        <w:gridCol w:w="1872"/>
+        <w:gridCol w:w="1872"/>
+        <w:gridCol w:w="1872"/>
+        <w:gridCol w:w="1872"/>
+      </w:tblGrid>
+      <w:tr>
+        <w:tc>
+          <w:tcPr>
+            <w:tcW w:type="dxa" w:w="1872"/>
+          </w:tcPr>
+          <w:p>
+            <w:r>
+              <w:t>Field</w:t>
+            </w:r>
+          </w:p>
+        </w:tc>
+        <w:tc>
+          <w:tcPr>
+            <w:tcW w:type="dxa" w:w="1872"/>
+          </w:tcPr>
+          <w:p>
+            <w:r>
+              <w:t>Type</w:t>
+            </w:r>
+          </w:p>
+        </w:tc>
+        <w:tc>
+          <w:tcPr>
+            <w:tcW w:type="dxa" w:w="1872"/>
+          </w:tcPr>
+          <w:p>
+            <w:r>
+              <w:t>Null</w:t>
+            </w:r>
+          </w:p>
+        </w:tc>
+        <w:tc>
+          <w:tcPr>
+            <w:tcW w:type="dxa" w:w="1872"/>
+          </w:tcPr>
+          <w:p>
+            <w:r>
+              <w:t>Key</w:t>
+            </w:r>
+          </w:p>
+        </w:tc>
+        <w:tc>
+          <w:tcPr>
+            <w:tcW w:type="dxa" w:w="1872"/>
+          </w:tcPr>
+          <w:p>
+            <w:r>
+              <w:t>Description</w:t>
+            </w:r>
+          </w:p>
+        </w:tc>
+      </w:tr>
+      <w:tr>
+        <w:tc>
+          <w:tcPr>
+            <w:tcW w:type="dxa" w:w="1872"/>
+          </w:tcPr>
+          <w:p>
+            <w:r>
+              <w:t>id</w:t>
+            </w:r>
+          </w:p>
+        </w:tc>
+        <w:tc>
+          <w:tcPr>
+            <w:tcW w:type="dxa" w:w="1872"/>
+          </w:tcPr>
+          <w:p>
+            <w:r>
+              <w:t>INTEGER</w:t>
+            </w:r>
+          </w:p>
+        </w:tc>
+        <w:tc>
+          <w:tcPr>
+            <w:tcW w:type="dxa" w:w="1872"/>
+          </w:tcPr>
+          <w:p>
+            <w:r>
+              <w:t>NO</w:t>
+            </w:r>
+          </w:p>
+        </w:tc>
+        <w:tc>
+          <w:tcPr>
+            <w:tcW w:type="dxa" w:w="1872"/>
+          </w:tcPr>
+          <w:p>
+            <w:r>
+              <w:t>PK</w:t>
+            </w:r>
+          </w:p>
+        </w:tc>
+        <w:tc>
+          <w:tcPr>
+            <w:tcW w:type="dxa" w:w="1872"/>
+          </w:tcPr>
+          <w:p>
+            <w:r>
+              <w:t>Định danh log</w:t>
+            </w:r>
+          </w:p>
+        </w:tc>
+      </w:tr>
+      <w:tr>
+        <w:tc>
+          <w:tcPr>
+            <w:tcW w:type="dxa" w:w="1872"/>
+          </w:tcPr>
+          <w:p>
+            <w:r>
+              <w:t>user_id</w:t>
+            </w:r>
+          </w:p>
+        </w:tc>
+        <w:tc>
+          <w:tcPr>
+            <w:tcW w:type="dxa" w:w="1872"/>
+          </w:tcPr>
+          <w:p>
+            <w:r>
+              <w:t>INTEGER</w:t>
+            </w:r>
+          </w:p>
+        </w:tc>
+        <w:tc>
+          <w:tcPr>
+            <w:tcW w:type="dxa" w:w="1872"/>
+          </w:tcPr>
+          <w:p>
+            <w:r>
+              <w:t>YES</w:t>
+            </w:r>
+          </w:p>
+        </w:tc>
+        <w:tc>
+          <w:tcPr>
+            <w:tcW w:type="dxa" w:w="1872"/>
+          </w:tcPr>
+          <w:p>
+            <w:r>
+              <w:t>FK</w:t>
+            </w:r>
+          </w:p>
+        </w:tc>
+        <w:tc>
+          <w:tcPr>
+            <w:tcW w:type="dxa" w:w="1872"/>
+          </w:tcPr>
+          <w:p>
+            <w:r>
+              <w:t>Người dùng thực hiện AI request (FK → USERS.id)</w:t>
+            </w:r>
+          </w:p>
+        </w:tc>
+      </w:tr>
+      <w:tr>
+        <w:tc>
+          <w:tcPr>
+            <w:tcW w:type="dxa" w:w="1872"/>
+          </w:tcPr>
+          <w:p>
+            <w:r>
+              <w:t>customer_id</w:t>
+            </w:r>
+          </w:p>
+        </w:tc>
+        <w:tc>
+          <w:tcPr>
+            <w:tcW w:type="dxa" w:w="1872"/>
+          </w:tcPr>
+          <w:p>
+            <w:r>
+              <w:t>INTEGER</w:t>
+            </w:r>
+          </w:p>
+        </w:tc>
+        <w:tc>
+          <w:tcPr>
+            <w:tcW w:type="dxa" w:w="1872"/>
+          </w:tcPr>
+          <w:p>
+            <w:r>
+              <w:t>YES</w:t>
+            </w:r>
+          </w:p>
+        </w:tc>
+        <w:tc>
+          <w:tcPr>
+            <w:tcW w:type="dxa" w:w="1872"/>
+          </w:tcPr>
+          <w:p>
+            <w:r>
+              <w:t>FK</w:t>
+            </w:r>
+          </w:p>
+        </w:tc>
+        <w:tc>
+          <w:tcPr>
+            <w:tcW w:type="dxa" w:w="1872"/>
+          </w:tcPr>
+          <w:p>
+            <w:r>
+              <w:t>Khách hàng liên quan (FK → CUSTOMERS.id)</w:t>
+            </w:r>
+          </w:p>
+        </w:tc>
+      </w:tr>
+      <w:tr>
+        <w:tc>
+          <w:tcPr>
+            <w:tcW w:type="dxa" w:w="1872"/>
+          </w:tcPr>
+          <w:p>
+            <w:r>
+              <w:t>request_type</w:t>
+            </w:r>
+          </w:p>
+        </w:tc>
+        <w:tc>
+          <w:tcPr>
+            <w:tcW w:type="dxa" w:w="1872"/>
+          </w:tcPr>
+          <w:p>
+            <w:r>
+              <w:t>VARCHAR(50)</w:t>
+            </w:r>
+          </w:p>
+        </w:tc>
+        <w:tc>
+          <w:tcPr>
+            <w:tcW w:type="dxa" w:w="1872"/>
+          </w:tcPr>
+          <w:p>
+            <w:r>
+              <w:t>NO</w:t>
+            </w:r>
+          </w:p>
+        </w:tc>
+        <w:tc>
+          <w:tcPr>
+            <w:tcW w:type="dxa" w:w="1872"/>
+          </w:tcPr>
+          <w:p>
+            <w:r/>
+          </w:p>
+        </w:tc>
+        <w:tc>
+          <w:tcPr>
+            <w:tcW w:type="dxa" w:w="1872"/>
+          </w:tcPr>
+          <w:p>
+            <w:r>
+              <w:t>Loại yêu cầu AI (recommend, care_message, summary)</w:t>
+            </w:r>
+          </w:p>
+        </w:tc>
+      </w:tr>
+      <w:tr>
+        <w:tc>
+          <w:tcPr>
+            <w:tcW w:type="dxa" w:w="1872"/>
+          </w:tcPr>
+          <w:p>
+            <w:r>
+              <w:t>model</w:t>
+            </w:r>
+          </w:p>
+        </w:tc>
+        <w:tc>
+          <w:tcPr>
+            <w:tcW w:type="dxa" w:w="1872"/>
+          </w:tcPr>
+          <w:p>
+            <w:r>
+              <w:t>VARCHAR(50)</w:t>
+            </w:r>
+          </w:p>
+        </w:tc>
+        <w:tc>
+          <w:tcPr>
+            <w:tcW w:type="dxa" w:w="1872"/>
+          </w:tcPr>
+          <w:p>
+            <w:r>
+              <w:t>NO</w:t>
+            </w:r>
+          </w:p>
+        </w:tc>
+        <w:tc>
+          <w:tcPr>
+            <w:tcW w:type="dxa" w:w="1872"/>
+          </w:tcPr>
+          <w:p>
+            <w:r/>
+          </w:p>
+        </w:tc>
+        <w:tc>
+          <w:tcPr>
+            <w:tcW w:type="dxa" w:w="1872"/>
+          </w:tcPr>
+          <w:p>
+            <w:r>
+              <w:t>Model AI được sử dụng</w:t>
+            </w:r>
+          </w:p>
+        </w:tc>
+      </w:tr>
+      <w:tr>
+        <w:tc>
+          <w:tcPr>
+            <w:tcW w:type="dxa" w:w="1872"/>
+          </w:tcPr>
+          <w:p>
+            <w:r>
+              <w:t>status</w:t>
+            </w:r>
+          </w:p>
+        </w:tc>
+        <w:tc>
+          <w:tcPr>
+            <w:tcW w:type="dxa" w:w="1872"/>
+          </w:tcPr>
+          <w:p>
+            <w:r>
+              <w:t>VARCHAR(20)</w:t>
+            </w:r>
+          </w:p>
+        </w:tc>
+        <w:tc>
+          <w:tcPr>
+            <w:tcW w:type="dxa" w:w="1872"/>
+          </w:tcPr>
+          <w:p>
+            <w:r>
+              <w:t>NO</w:t>
+            </w:r>
+          </w:p>
+        </w:tc>
+        <w:tc>
+          <w:tcPr>
+            <w:tcW w:type="dxa" w:w="1872"/>
+          </w:tcPr>
+          <w:p>
+            <w:r/>
+          </w:p>
+        </w:tc>
+        <w:tc>
+          <w:tcPr>
+            <w:tcW w:type="dxa" w:w="1872"/>
+          </w:tcPr>
+          <w:p>
+            <w:r>
+              <w:t>SUCCESS / FALLBACK / ERROR</w:t>
+            </w:r>
+          </w:p>
+        </w:tc>
+      </w:tr>
+      <w:tr>
+        <w:tc>
+          <w:tcPr>
+            <w:tcW w:type="dxa" w:w="1872"/>
+          </w:tcPr>
+          <w:p>
+            <w:r>
+              <w:t>prompt_details</w:t>
+            </w:r>
+          </w:p>
+        </w:tc>
+        <w:tc>
+          <w:tcPr>
+            <w:tcW w:type="dxa" w:w="1872"/>
+          </w:tcPr>
+          <w:p>
+            <w:r>
+              <w:t>TEXT</w:t>
+            </w:r>
+          </w:p>
+        </w:tc>
+        <w:tc>
+          <w:tcPr>
+            <w:tcW w:type="dxa" w:w="1872"/>
+          </w:tcPr>
+          <w:p>
+            <w:r>
+              <w:t>YES</w:t>
+            </w:r>
+          </w:p>
+        </w:tc>
+        <w:tc>
+          <w:tcPr>
+            <w:tcW w:type="dxa" w:w="1872"/>
+          </w:tcPr>
+          <w:p>
+            <w:r/>
+          </w:p>
+        </w:tc>
+        <w:tc>
+          <w:tcPr>
+            <w:tcW w:type="dxa" w:w="1872"/>
+          </w:tcPr>
+          <w:p>
+            <w:r>
+              <w:t>Thông tin request phục vụ audit</w:t>
+            </w:r>
+          </w:p>
+        </w:tc>
+      </w:tr>
+      <w:tr>
+        <w:tc>
+          <w:tcPr>
+            <w:tcW w:type="dxa" w:w="1872"/>
+          </w:tcPr>
+          <w:p>
+            <w:r>
+              <w:t>response_details</w:t>
+            </w:r>
+          </w:p>
+        </w:tc>
+        <w:tc>
+          <w:tcPr>
+            <w:tcW w:type="dxa" w:w="1872"/>
+          </w:tcPr>
+          <w:p>
+            <w:r>
+              <w:t>TEXT</w:t>
+            </w:r>
+          </w:p>
+        </w:tc>
+        <w:tc>
+          <w:tcPr>
+            <w:tcW w:type="dxa" w:w="1872"/>
+          </w:tcPr>
+          <w:p>
+            <w:r>
+              <w:t>YES</w:t>
+            </w:r>
+          </w:p>
+        </w:tc>
+        <w:tc>
+          <w:tcPr>
+            <w:tcW w:type="dxa" w:w="1872"/>
+          </w:tcPr>
+          <w:p>
+            <w:r/>
+          </w:p>
+        </w:tc>
+        <w:tc>
+          <w:tcPr>
+            <w:tcW w:type="dxa" w:w="1872"/>
+          </w:tcPr>
+          <w:p>
+            <w:r>
+              <w:t>Thông tin response phục vụ audit</w:t>
+            </w:r>
+          </w:p>
+        </w:tc>
+      </w:tr>
+      <w:tr>
+        <w:tc>
+          <w:tcPr>
+            <w:tcW w:type="dxa" w:w="1872"/>
+          </w:tcPr>
+          <w:p>
+            <w:r>
+              <w:t>error_message</w:t>
+            </w:r>
+          </w:p>
+        </w:tc>
+        <w:tc>
+          <w:tcPr>
+            <w:tcW w:type="dxa" w:w="1872"/>
+          </w:tcPr>
+          <w:p>
+            <w:r>
+              <w:t>TEXT</w:t>
+            </w:r>
+          </w:p>
+        </w:tc>
+        <w:tc>
+          <w:tcPr>
+            <w:tcW w:type="dxa" w:w="1872"/>
+          </w:tcPr>
+          <w:p>
+            <w:r>
+              <w:t>YES</w:t>
+            </w:r>
+          </w:p>
+        </w:tc>
+        <w:tc>
+          <w:tcPr>
+            <w:tcW w:type="dxa" w:w="1872"/>
+          </w:tcPr>
+          <w:p>
+            <w:r/>
+          </w:p>
+        </w:tc>
+        <w:tc>
+          <w:tcPr>
+            <w:tcW w:type="dxa" w:w="1872"/>
+          </w:tcPr>
+          <w:p>
+            <w:r>
+              <w:t>Thông tin lỗi nếu có</w:t>
+            </w:r>
+          </w:p>
+        </w:tc>
+      </w:tr>
+      <w:tr>
+        <w:tc>
+          <w:tcPr>
+            <w:tcW w:type="dxa" w:w="1872"/>
+          </w:tcPr>
+          <w:p>
+            <w:r>
+              <w:t>processing_time_ms</w:t>
+            </w:r>
+          </w:p>
+        </w:tc>
+        <w:tc>
+          <w:tcPr>
+            <w:tcW w:type="dxa" w:w="1872"/>
+          </w:tcPr>
+          <w:p>
+            <w:r>
+              <w:t>INTEGER</w:t>
+            </w:r>
+          </w:p>
+        </w:tc>
+        <w:tc>
+          <w:tcPr>
+            <w:tcW w:type="dxa" w:w="1872"/>
+          </w:tcPr>
+          <w:p>
+            <w:r>
+              <w:t>YES</w:t>
+            </w:r>
+          </w:p>
+        </w:tc>
+        <w:tc>
+          <w:tcPr>
+            <w:tcW w:type="dxa" w:w="1872"/>
+          </w:tcPr>
+          <w:p>
+            <w:r/>
+          </w:p>
+        </w:tc>
+        <w:tc>
+          <w:tcPr>
+            <w:tcW w:type="dxa" w:w="1872"/>
+          </w:tcPr>
+          <w:p>
+            <w:r>
+              <w:t>Thời gian xử lý AI request, tính bằng time.perf_counter() milliseconds</w:t>
+            </w:r>
+          </w:p>
+        </w:tc>
+      </w:tr>
+      <w:tr>
+        <w:tc>
+          <w:tcPr>
+            <w:tcW w:type="dxa" w:w="1872"/>
+          </w:tcPr>
+          <w:p>
+            <w:r>
+              <w:t>created_at</w:t>
+            </w:r>
+          </w:p>
+        </w:tc>
+        <w:tc>
+          <w:tcPr>
+            <w:tcW w:type="dxa" w:w="1872"/>
+          </w:tcPr>
+          <w:p>
+            <w:r>
+              <w:t>DATETIME</w:t>
+            </w:r>
+          </w:p>
+        </w:tc>
+        <w:tc>
+          <w:tcPr>
+            <w:tcW w:type="dxa" w:w="1872"/>
+          </w:tcPr>
+          <w:p>
+            <w:r>
+              <w:t>NO</w:t>
+            </w:r>
+          </w:p>
+        </w:tc>
+        <w:tc>
+          <w:tcPr>
+            <w:tcW w:type="dxa" w:w="1872"/>
+          </w:tcPr>
+          <w:p>
+            <w:r/>
+          </w:p>
+        </w:tc>
+        <w:tc>
+          <w:tcPr>
+            <w:tcW w:type="dxa" w:w="1872"/>
+          </w:tcPr>
+          <w:p>
+            <w:r>
+              <w:t>Thời điểm tạo log</w:t>
+            </w:r>
+          </w:p>
+        </w:tc>
+      </w:tr>
+    </w:tbl>
     <w:p>
       <w:pPr>
         <w:rPr>
@@ -25162,6 +26182,11 @@
           <w:szCs w:val="28"/>
         </w:rPr>
         <w:t>2.1. Cơ sở dữ liệu quan hệ (ERD &amp; Data Dictionary)</w:t>
+      </w:r>
+    </w:p>
+    <w:p>
+      <w:r>
+        <w:t>Ghi chú: Bảng AI_LOGS được bổ sung vào kiến trúc dữ liệu để lưu vết các tương tác AI. AI_LOGS liên kết tùy chọn với USERS thông qua user_id và CUSTOMERS thông qua customer_id. Do sơ đồ ERD hiện tại được lưu dưới dạng hình ảnh tĩnh, cấu trúc chi tiết của AI_LOGS được trình bày tại phần Table Schema/Data Dictionary.</w:t>
       </w:r>
     </w:p>
     <w:p>
@@ -52282,6 +53307,11 @@
           <w:szCs w:val="28"/>
         </w:rPr>
       </w:pPr>
+    </w:p>
+    <w:p>
+      <w:r>
+        <w:t>Ghi chú AI Module: AI module sử dụng catalog guard để hạn chế recommendation vào service catalog hợp lệ, kết hợp structured output/fallback và persistent AI logging nhằm hỗ trợ audit.</w:t>
+      </w:r>
     </w:p>
     <w:sectPr>
       <w:pgSz w:w="12240" w:h="15840"/>

</xml_diff>